<commit_message>
docs(M5): corregir contacto en la base de conocimiento (mail/WhatsApp reales)
Reemplaza los telefonos/portal heredados del sitio original (0800-666-6587,
+54911 4493-2017, 1144932017, 4821-1600, miportalclinicas) por el contacto
real: mwquiero@gmail.com y WhatsApp por chat en el Workflow. Afecta Inicio,
Especialidades, Residencias y 3 novedades + el consolidado. Reingerido a
Qdrant (coleccion recreada limpia, 51 chunks, 0 con datos viejos).

Co-Authored-By: Claude Opus 4.8 <noreply@anthropic.com>
</commit_message>
<xml_diff>
--- a/Avanzado/Modulo5/documentacion/01_Inicio.docx
+++ b/Avanzado/Modulo5/documentacion/01_Inicio.docx
@@ -88,7 +88,7 @@
         <w:pStyle w:val="Heading1"/>
       </w:pPr>
       <w:r>
-        <w:t>Central de turnos</w:t>
+        <w:t>Turnos por mail</w:t>
       </w:r>
     </w:p>
     <w:p>
@@ -96,10 +96,10 @@
         <w:rPr>
           <w:b/>
         </w:rPr>
-        <w:t xml:space="preserve">Central de turnos: </w:t>
+        <w:t xml:space="preserve">Turnos por mail: </w:t>
       </w:r>
       <w:r>
-        <w:t>0800-666-6587</w:t>
+        <w:t>mwquiero@gmail.com</w:t>
       </w:r>
     </w:p>
     <w:p>
@@ -107,10 +107,10 @@
         <w:rPr>
           <w:b/>
         </w:rPr>
-        <w:t xml:space="preserve">Turnos por WhatsApp: </w:t>
+        <w:t xml:space="preserve">WhatsApp: </w:t>
       </w:r>
       <w:r>
-        <w:t>+549 11 4493-2017</w:t>
+        <w:t>por chat en el Workflow del asistente</w:t>
       </w:r>
     </w:p>
     <w:p>
@@ -118,10 +118,10 @@
         <w:rPr>
           <w:b/>
         </w:rPr>
-        <w:t xml:space="preserve">Conmutador: </w:t>
+        <w:t xml:space="preserve">Consultas por mail: </w:t>
       </w:r>
       <w:r>
-        <w:t>(54-11) 4821-1600</w:t>
+        <w:t>mwquiero@gmail.com</w:t>
       </w:r>
     </w:p>
     <w:p>

</xml_diff>